<commit_message>
OV01 de-telegraph (Codex byte-audit): routine pending-signature order set
The order-set surface advertised the catch (DRAFT/NOT RECONCILED/carried
forward). Per Codex, change the surface not the grader: rewrote E1-T1 as a
routine DISCHARGE MEDICATION ORDERS pending signature (0 telegraph strings),
blended enoxaparin into the continuation rows ('continue until mobility returns
to baseline'), held agents read 'Resume'. Prompt now forces a row-level
disposition (sign/change/stop each + why). Golden + grader untouched. Gate green.
If re-pilot still ceilings, pivot to OV07 (colder source geometry).
</commit_message>
<xml_diff>
--- a/worlds/ondina-vasquell/phase-3-build-task-artifacts/platform/task1/current/preliminary_discharge_order_set_05212026.docx
+++ b/worlds/ondina-vasquell/phase-3-build-task-artifacts/platform/task1/current/preliminary_discharge_order_set_05212026.docx
@@ -272,7 +272,7 @@
                 <w:color w:val="232830"/>
                 <w:sz w:val="16"/>
               </w:rPr>
-              <w:t>PRELIMINARY DISCHARGE ORDER SET (DRAFT - NOT RECONCILED)</w:t>
+              <w:t>DISCHARGE MEDICATION ORDERS</w:t>
             </w:r>
           </w:p>
         </w:tc>
@@ -288,7 +288,7 @@
           <w:color w:val="1F3864"/>
           <w:sz w:val="28"/>
         </w:rPr>
-        <w:t>PRELIMINARY DISCHARGE ORDER SET (DRAFT - NOT RECONCILED)</w:t>
+        <w:t>DISCHARGE MEDICATION ORDERS</w:t>
       </w:r>
     </w:p>
     <w:p>
@@ -300,7 +300,7 @@
           <w:color w:val="5E6670"/>
           <w:sz w:val="16"/>
         </w:rPr>
-        <w:t>Filed 05/21/2026 1830 | Status: Draft, pending reconciliation | RE: Ondina Vasquell | MRN OV-3358104 | CSN-308852140</w:t>
+        <w:t>Queued 05/21/2026 1830 | Status: Pending physician signature | RE: Ondina Vasquell | MRN OV-3358104 | CSN-308852140</w:t>
       </w:r>
     </w:p>
     <w:p>
@@ -550,7 +550,7 @@
           <w:color w:val="232830"/>
           <w:sz w:val="19"/>
         </w:rPr>
-        <w:t>Auto-populated draft discharge orders carried forward from active inpatient orders. Not yet reconciled against home medications or current renal function.</w:t>
+        <w:t>Discharge medication orders prepared for the discharging physician's review and signature.</w:t>
       </w:r>
     </w:p>
     <w:p>
@@ -568,7 +568,7 @@
           <w:color w:val="4472C4"/>
           <w:sz w:val="20"/>
         </w:rPr>
-        <w:t>MEDICATIONS CARRIED FORWARD</w:t>
+        <w:t>DISCHARGE MEDICATIONS</w:t>
       </w:r>
     </w:p>
     <w:tbl>
@@ -640,7 +640,7 @@
                 <w:color w:val="FFFFFF"/>
                 <w:sz w:val="16"/>
               </w:rPr>
-              <w:t>Note on draft</w:t>
+              <w:t>Order</w:t>
             </w:r>
           </w:p>
         </w:tc>
@@ -693,7 +693,7 @@
                 <w:color w:val="232830"/>
                 <w:sz w:val="16"/>
               </w:rPr>
-              <w:t>Admission empiric dose carried forward; oral step-down and duration not set</w:t>
+              <w:t>Continue</w:t>
             </w:r>
           </w:p>
         </w:tc>
@@ -731,7 +731,7 @@
                 <w:color w:val="232830"/>
                 <w:sz w:val="16"/>
               </w:rPr>
-              <w:t>Inpatient-adjusted units Subcutaneous nightly</w:t>
+              <w:t>Adjusted units Subcutaneous nightly</w:t>
             </w:r>
           </w:p>
         </w:tc>
@@ -749,7 +749,7 @@
                 <w:color w:val="232830"/>
                 <w:sz w:val="16"/>
               </w:rPr>
-              <w:t>Reconcile to home 26 units versus inpatient adjustment</w:t>
+              <w:t>Continue</w:t>
             </w:r>
           </w:p>
         </w:tc>
@@ -1076,7 +1076,7 @@
                 <w:color w:val="232830"/>
                 <w:sz w:val="16"/>
               </w:rPr>
-              <w:t>Continue; renal check</w:t>
+              <w:t>Continue</w:t>
             </w:r>
           </w:p>
         </w:tc>
@@ -1238,7 +1238,7 @@
                 <w:color w:val="232830"/>
                 <w:sz w:val="16"/>
               </w:rPr>
-              <w:t>Carried forward from active inpatient orders</w:t>
+              <w:t>Continue until mobility returns to baseline</w:t>
             </w:r>
           </w:p>
         </w:tc>
@@ -1294,7 +1294,7 @@
                 <w:color w:val="232830"/>
                 <w:sz w:val="16"/>
               </w:rPr>
-              <w:t>Status ambiguous: held inpatient, not marked resume or continue-hold</w:t>
+              <w:t>Resume</w:t>
             </w:r>
           </w:p>
         </w:tc>
@@ -1347,7 +1347,7 @@
                 <w:color w:val="232830"/>
                 <w:sz w:val="16"/>
               </w:rPr>
-              <w:t>Status ambiguous: held inpatient, not marked resume or continue-hold</w:t>
+              <w:t>Resume</w:t>
             </w:r>
           </w:p>
         </w:tc>
@@ -1403,25 +1403,13 @@
                 <w:color w:val="232830"/>
                 <w:sz w:val="16"/>
               </w:rPr>
-              <w:t>Status ambiguous: held inpatient, not marked resume or continue-hold</w:t>
+              <w:t>Resume</w:t>
             </w:r>
           </w:p>
         </w:tc>
       </w:tr>
     </w:tbl>
     <w:p/>
-    <w:p>
-      <w:r>
-        <w:rPr>
-          <w:rFonts w:ascii="Arial" w:hAnsi="Arial"/>
-          <w:b w:val="0"/>
-          <w:i w:val="0"/>
-          <w:color w:val="232830"/>
-          <w:sz w:val="19"/>
-        </w:rPr>
-        <w:t>This draft has not been reconciled. The intravenous antibiotic line, the held oral agents, and the insulin dose require clinician reconciliation before discharge. No reconciliation decision is recorded here.</w:t>
-      </w:r>
-    </w:p>
     <w:p>
       <w:pPr>
         <w:spacing w:before="200"/>
@@ -1437,7 +1425,7 @@
           <w:color w:val="5E6670"/>
           <w:sz w:val="18"/>
         </w:rPr>
-        <w:t>Preliminary order set filed on 05/21/2026 1830</w:t>
+        <w:t>Discharge medication orders queued 05/21/2026 1830, pending physician signature</w:t>
       </w:r>
     </w:p>
     <w:sectPr>
@@ -1470,7 +1458,7 @@
         <w:color w:val="5E6670"/>
         <w:sz w:val="15"/>
       </w:rPr>
-      <w:t>Harbor Crest Regional Medical Center  |  PRELIMINARY DISCHARGE ORDER SET (DRAFT - NOT RECONCILED)  |  Confidential</w:t>
+      <w:t>Harbor Crest Regional Medical Center  |  DISCHARGE MEDICATION ORDERS  |  Confidential</w:t>
     </w:r>
   </w:p>
 </w:ftr>
@@ -1490,7 +1478,7 @@
         <w:color w:val="5E6670"/>
         <w:sz w:val="15"/>
       </w:rPr>
-      <w:t>Harbor Crest Regional Medical Center  |  PRELIMINARY DISCHARGE ORDER SET (DRAFT - NOT RECONCILED)  |  Confidential</w:t>
+      <w:t>Harbor Crest Regional Medical Center  |  DISCHARGE MEDICATION ORDERS  |  Confidential</w:t>
     </w:r>
   </w:p>
 </w:ftr>
@@ -1510,7 +1498,7 @@
         <w:color w:val="5E6670"/>
         <w:sz w:val="15"/>
       </w:rPr>
-      <w:t>Harbor Crest Regional Medical Center  |  PRELIMINARY DISCHARGE ORDER SET (DRAFT - NOT RECONCILED)  |  Confidential</w:t>
+      <w:t>Harbor Crest Regional Medical Center  |  DISCHARGE MEDICATION ORDERS  |  Confidential</w:t>
     </w:r>
   </w:p>
 </w:ftr>

</xml_diff>